<commit_message>
update: singleton working details into docx
</commit_message>
<xml_diff>
--- a/docs/TIVIDY_Generic_Workflow_Specification.docx
+++ b/docs/TIVIDY_Generic_Workflow_Specification.docx
@@ -2913,9 +2913,7 @@
               </w:rPr>
               <w:t># parent: SubProcess*</w:t>
             </w:r>
-            <w:r>
-              <w:br/>
-            </w:r>
+            <w:r/>
             <w:r>
               <w:rPr>
                 <w:rFonts w:ascii="Consolas" w:hAnsi="Consolas" w:eastAsia="Consolas" w:cs="Consolas"/>
@@ -2923,7 +2921,6 @@
                 <w:sz w:val="15"/>
                 <w:szCs w:val="15"/>
               </w:rPr>
-              <w:t># listeners: vector&lt;WorkflowEventListener*&gt;</w:t>
             </w:r>
             <w:r>
               <w:br/>
@@ -3026,7 +3023,7 @@
                 <w:sz w:val="15"/>
                 <w:szCs w:val="15"/>
               </w:rPr>
-              <w:t>+ attach(l) / detach(l) / notify(e) // Observer</w:t>
+              <w:t># publish(e) // EventDispatcher::getInstance().notifyListeners(e)</w:t>
             </w:r>
             <w:r>
               <w:br/>
@@ -9587,7 +9584,7 @@
                 <w:sz w:val="17"/>
                 <w:szCs w:val="17"/>
               </w:rPr>
-              <w:t xml:space="preserve">Subject: </w:t>
+              <w:t>Subject: EventDispatcher (the Singleton, 3.13) · Observer: WorkflowEventListener · ConcreteObservers: below · Publisher: WorkItem</w:t>
             </w:r>
             <w:r>
               <w:rPr>
@@ -9596,14 +9593,12 @@
                 <w:sz w:val="15"/>
                 <w:szCs w:val="15"/>
               </w:rPr>
-              <w:t>WorkItem</w:t>
-            </w:r>
-            <w:r>
-              <w:rPr>
-                <w:sz w:val="17"/>
-                <w:szCs w:val="17"/>
-              </w:rPr>
-              <w:t xml:space="preserve"> · Observer: </w:t>
+            </w:r>
+            <w:r>
+              <w:rPr>
+                <w:sz w:val="17"/>
+                <w:szCs w:val="17"/>
+              </w:rPr>
             </w:r>
             <w:r>
               <w:rPr>
@@ -9612,14 +9607,12 @@
                 <w:sz w:val="15"/>
                 <w:szCs w:val="15"/>
               </w:rPr>
-              <w:t>WorkflowEventListener</w:t>
-            </w:r>
-            <w:r>
-              <w:rPr>
-                <w:sz w:val="17"/>
-                <w:szCs w:val="17"/>
-              </w:rPr>
-              <w:t xml:space="preserve"> · ConcreteObservers: below</w:t>
+            </w:r>
+            <w:r>
+              <w:rPr>
+                <w:sz w:val="17"/>
+                <w:szCs w:val="17"/>
+              </w:rPr>
             </w:r>
           </w:p>
         </w:tc>
@@ -10394,14 +10387,7 @@
         <w:ind w:left="340"/>
       </w:pPr>
       <w:r>
-        <w:t xml:space="preserve">1. </w:t>
-      </w:r>
-      <w:r>
-        <w:rPr>
-          <w:sz w:val="19"/>
-          <w:szCs w:val="19"/>
-        </w:rPr>
-        <w:t>When an instance is created, the engine attaches its global listeners to every item in the tree.</w:t>
+        <w:t>1. When the client calls addListener(l), the engine keeps ownership of l and attaches it once with EventDispatcher::getInstance().attachListener(l). Listeners are not attached to individual items.</w:t>
       </w:r>
     </w:p>
     <w:p>
@@ -10410,62 +10396,7 @@
         <w:ind w:left="340"/>
       </w:pPr>
       <w:r>
-        <w:t xml:space="preserve">2. </w:t>
-      </w:r>
-      <w:r>
-        <w:rPr>
-          <w:sz w:val="19"/>
-          <w:szCs w:val="19"/>
-        </w:rPr>
-        <w:t xml:space="preserve">Every state transition calls </w:t>
-      </w:r>
-      <w:r>
-        <w:rPr>
-          <w:rFonts w:ascii="Consolas" w:hAnsi="Consolas" w:eastAsia="Consolas" w:cs="Consolas"/>
-          <w:color w:val="1F3864"/>
-          <w:sz w:val="17"/>
-          <w:szCs w:val="17"/>
-        </w:rPr>
-        <w:t>item.notify(WorkflowEvent{...})</w:t>
-      </w:r>
-      <w:r>
-        <w:rPr>
-          <w:sz w:val="19"/>
-          <w:szCs w:val="19"/>
-        </w:rPr>
-        <w:t xml:space="preserve">, which loops over </w:t>
-      </w:r>
-      <w:r>
-        <w:rPr>
-          <w:rFonts w:ascii="Consolas" w:hAnsi="Consolas" w:eastAsia="Consolas" w:cs="Consolas"/>
-          <w:color w:val="1F3864"/>
-          <w:sz w:val="17"/>
-          <w:szCs w:val="17"/>
-        </w:rPr>
-        <w:t>listeners</w:t>
-      </w:r>
-      <w:r>
-        <w:rPr>
-          <w:sz w:val="19"/>
-          <w:szCs w:val="19"/>
-        </w:rPr>
-        <w:t xml:space="preserve"> and calls </w:t>
-      </w:r>
-      <w:r>
-        <w:rPr>
-          <w:rFonts w:ascii="Consolas" w:hAnsi="Consolas" w:eastAsia="Consolas" w:cs="Consolas"/>
-          <w:color w:val="1F3864"/>
-          <w:sz w:val="17"/>
-          <w:szCs w:val="17"/>
-        </w:rPr>
-        <w:t>onEvent()</w:t>
-      </w:r>
-      <w:r>
-        <w:rPr>
-          <w:sz w:val="19"/>
-          <w:szCs w:val="19"/>
-        </w:rPr>
-        <w:t>.</w:t>
+        <w:t>2. Every state transition calls item.publish(WorkflowEvent{...}), which hands the event to EventDispatcher::getInstance().notifyListeners(e); the dispatcher loops over its listeners and calls onEvent().</w:t>
       </w:r>
     </w:p>
     <w:p>
@@ -10474,30 +10405,7 @@
         <w:ind w:left="340"/>
       </w:pPr>
       <w:r>
-        <w:t xml:space="preserve">3. </w:t>
-      </w:r>
-      <w:r>
-        <w:rPr>
-          <w:sz w:val="19"/>
-          <w:szCs w:val="19"/>
-        </w:rPr>
-        <w:t xml:space="preserve">Listeners filter by </w:t>
-      </w:r>
-      <w:r>
-        <w:rPr>
-          <w:rFonts w:ascii="Consolas" w:hAnsi="Consolas" w:eastAsia="Consolas" w:cs="Consolas"/>
-          <w:color w:val="1F3864"/>
-          <w:sz w:val="17"/>
-          <w:szCs w:val="17"/>
-        </w:rPr>
-        <w:t>type</w:t>
-      </w:r>
-      <w:r>
-        <w:rPr>
-          <w:sz w:val="19"/>
-          <w:szCs w:val="19"/>
-        </w:rPr>
-        <w:t xml:space="preserve"> themselves; the work item never knows what they do.</w:t>
+        <w:t>3. Listeners filter by type and instanceId themselves; neither the work item nor the dispatcher knows what they do.</w:t>
       </w:r>
     </w:p>
     <w:p>
@@ -10569,14 +10477,7 @@
         <w:ind w:left="340"/>
       </w:pPr>
       <w:r>
-        <w:t xml:space="preserve">• </w:t>
-      </w:r>
-      <w:r>
-        <w:rPr>
-          <w:sz w:val="19"/>
-          <w:szCs w:val="19"/>
-        </w:rPr>
-        <w:t>WorkItem → WorkflowEventListener: association (listeners), 1 → 0..* (not owned).</w:t>
+        <w:t>• EventDispatcher → WorkflowEventListener: association (listeners), 1 → 0..* (not owned).</w:t>
       </w:r>
     </w:p>
     <w:p>
@@ -10609,6 +10510,15 @@
           <w:szCs w:val="19"/>
         </w:rPr>
         <w:t>WorkflowEngine ◆→ WorkflowEventListener: composition (owns the listener objects).</w:t>
+      </w:r>
+    </w:p>
+    <w:p>
+      <w:pPr>
+        <w:spacing w:after="40" w:before="0" w:line="264" w:lineRule="auto"/>
+        <w:ind w:left="340"/>
+      </w:pPr>
+      <w:r>
+        <w:t>• WorkItem → EventDispatcher: dependency (publishes through getInstance()).</w:t>
       </w:r>
     </w:p>
     <w:p>
@@ -13927,6 +13837,500 @@
       </w:pPr>
       <w:r>
         <w:rPr>
+          <w:color w:val="DDEBF7"/>
+          <w:sz w:val="28"/>
+          <w:szCs w:val="28"/>
+        </w:rPr>
+        <w:t xml:space="preserve">■ </w:t>
+      </w:r>
+      <w:r>
+        <w:rPr>
+          <w:sz w:val="24"/>
+          <w:szCs w:val="24"/>
+        </w:rPr>
+        <w:t xml:space="preserve">3.13 Singleton </w:t>
+      </w:r>
+      <w:r>
+        <w:rPr>
+          <w:color w:val="44546A"/>
+          <w:sz w:val="24"/>
+          <w:szCs w:val="24"/>
+        </w:rPr>
+        <w:t>(Creational)</w:t>
+      </w:r>
+    </w:p>
+    <w:tbl>
+      <w:tblPr>
+        <w:tblW w:w="0" w:type="auto"/>
+        <w:tblLayout w:type="fixed"/>
+        <w:tblLook w:firstColumn="1" w:firstRow="1" w:lastColumn="0" w:lastRow="0" w:noHBand="0" w:noVBand="1" w:val="04A0"/>
+        <w:tblBorders>
+          <w:top w:val="single" w:color="8EA9DB" w:sz="4" w:space="0"/>
+          <w:left w:val="single" w:color="8EA9DB" w:sz="4" w:space="0"/>
+          <w:bottom w:val="single" w:color="8EA9DB" w:sz="4" w:space="0"/>
+          <w:right w:val="single" w:color="8EA9DB" w:sz="4" w:space="0"/>
+          <w:insideH w:val="single" w:color="8EA9DB" w:sz="4" w:space="0"/>
+          <w:insideV w:val="single" w:color="8EA9DB" w:sz="4" w:space="0"/>
+        </w:tblBorders>
+      </w:tblPr>
+      <w:tblGrid>
+        <w:gridCol w:w="1735"/>
+        <w:gridCol w:w="7903"/>
+      </w:tblGrid>
+      <w:tr>
+        <w:trPr>
+          <w:cantSplit/>
+          <w:hidden w:val="0"/>
+        </w:trPr>
+        <w:tc>
+          <w:tcPr>
+            <w:tcW w:w="1735" w:type="dxa"/>
+            <w:shd w:color="auto" w:fill="F2F2F2" w:val="clear"/>
+          </w:tcPr>
+          <w:p>
+            <w:pPr>
+              <w:spacing w:after="20" w:before="20" w:line="240" w:lineRule="auto"/>
+            </w:pPr>
+            <w:r>
+              <w:rPr>
+                <w:b/>
+                <w:sz w:val="17"/>
+                <w:szCs w:val="17"/>
+              </w:rPr>
+              <w:t>Engine problem</w:t>
+            </w:r>
+          </w:p>
+        </w:tc>
+        <w:tc>
+          <w:tcPr>
+            <w:tcW w:w="7903" w:type="dxa"/>
+          </w:tcPr>
+          <w:p>
+            <w:pPr>
+              <w:spacing w:after="20" w:before="20" w:line="240" w:lineRule="auto"/>
+            </w:pPr>
+            <w:r>
+              <w:rPr>
+                <w:sz w:val="17"/>
+                <w:szCs w:val="17"/>
+              </w:rPr>
+              <w:t>Listeners must receive every lifecycle event raised anywhere in the work-item tree, by any task, sub-process or state, in one consistent order. Passing a dispatcher pointer through every builder, instance and constructor couples the whole tree to the event system, and several dispatchers would split the audit trail.</w:t>
+            </w:r>
+          </w:p>
+        </w:tc>
+      </w:tr>
+      <w:tr>
+        <w:trPr>
+          <w:cantSplit/>
+          <w:hidden w:val="0"/>
+        </w:trPr>
+        <w:tc>
+          <w:tcPr>
+            <w:tcW w:w="1735" w:type="dxa"/>
+            <w:shd w:color="auto" w:fill="F2F2F2" w:val="clear"/>
+          </w:tcPr>
+          <w:p>
+            <w:pPr>
+              <w:spacing w:after="20" w:before="20" w:line="240" w:lineRule="auto"/>
+            </w:pPr>
+            <w:r>
+              <w:rPr>
+                <w:b/>
+                <w:sz w:val="17"/>
+                <w:szCs w:val="17"/>
+              </w:rPr>
+              <w:t>GoF roles</w:t>
+            </w:r>
+          </w:p>
+        </w:tc>
+        <w:tc>
+          <w:tcPr>
+            <w:tcW w:w="7903" w:type="dxa"/>
+          </w:tcPr>
+          <w:p>
+            <w:pPr>
+              <w:spacing w:after="20" w:before="20" w:line="240" w:lineRule="auto"/>
+            </w:pPr>
+            <w:r>
+              <w:rPr>
+                <w:sz w:val="17"/>
+                <w:szCs w:val="17"/>
+              </w:rPr>
+              <w:t>Singleton: EventDispatcher · Clients: WorkItem (publishes events), WorkflowEngine (attaches listeners) · EventDispatcher is also the Subject of Observer (3.8)</w:t>
+            </w:r>
+          </w:p>
+        </w:tc>
+      </w:tr>
+      <w:tr>
+        <w:trPr>
+          <w:cantSplit/>
+          <w:hidden w:val="0"/>
+        </w:trPr>
+        <w:tc>
+          <w:tcPr>
+            <w:tcW w:w="1735" w:type="dxa"/>
+            <w:shd w:color="auto" w:fill="F2F2F2" w:val="clear"/>
+          </w:tcPr>
+          <w:p>
+            <w:pPr>
+              <w:spacing w:after="20" w:before="20" w:line="240" w:lineRule="auto"/>
+            </w:pPr>
+            <w:r>
+              <w:rPr>
+                <w:b/>
+                <w:sz w:val="17"/>
+                <w:szCs w:val="17"/>
+              </w:rPr>
+              <w:t>What varies</w:t>
+            </w:r>
+          </w:p>
+        </w:tc>
+        <w:tc>
+          <w:tcPr>
+            <w:tcW w:w="7903" w:type="dxa"/>
+          </w:tcPr>
+          <w:p>
+            <w:pPr>
+              <w:spacing w:after="20" w:before="20" w:line="240" w:lineRule="auto"/>
+            </w:pPr>
+            <w:r>
+              <w:rPr>
+                <w:sz w:val="17"/>
+                <w:szCs w:val="17"/>
+              </w:rPr>
+              <w:t>The set of attached listeners. The single access point and the dispatch loop stay the same.</w:t>
+            </w:r>
+          </w:p>
+        </w:tc>
+      </w:tr>
+    </w:tbl>
+    <w:p>
+      <w:pPr>
+        <w:spacing w:after="40" w:before="0" w:line="192" w:lineRule="auto"/>
+      </w:pPr>
+    </w:p>
+    <w:tbl>
+      <w:tblPr>
+        <w:tblW w:w="9637" w:type="dxa"/>
+        <w:tblLayout w:type="fixed"/>
+        <w:tblLook w:firstColumn="1" w:firstRow="1" w:lastColumn="0" w:lastRow="0" w:noHBand="0" w:noVBand="1" w:val="04A0"/>
+        <w:tblBorders>
+          <w:top w:val="single" w:color="8EA9DB" w:sz="4" w:space="0"/>
+          <w:left w:val="single" w:color="8EA9DB" w:sz="4" w:space="0"/>
+          <w:bottom w:val="single" w:color="8EA9DB" w:sz="4" w:space="0"/>
+          <w:right w:val="single" w:color="8EA9DB" w:sz="4" w:space="0"/>
+          <w:insideH w:val="single" w:color="8EA9DB" w:sz="4" w:space="0"/>
+          <w:insideV w:val="single" w:color="8EA9DB" w:sz="4" w:space="0"/>
+        </w:tblBorders>
+      </w:tblPr>
+      <w:tblGrid>
+        <w:gridCol w:w="2144"/>
+        <w:gridCol w:w="940"/>
+        <w:gridCol w:w="2891"/>
+        <w:gridCol w:w="3662"/>
+      </w:tblGrid>
+      <w:tr>
+        <w:trPr>
+          <w:cantSplit/>
+          <w:hidden w:val="0"/>
+          <w:tblHeader/>
+        </w:trPr>
+        <w:tc>
+          <w:tcPr>
+            <w:tcW w:w="2144" w:type="dxa"/>
+            <w:shd w:color="auto" w:fill="D9E2F3" w:val="clear"/>
+          </w:tcPr>
+          <w:p>
+            <w:pPr>
+              <w:spacing w:after="20" w:before="20" w:line="240" w:lineRule="auto"/>
+            </w:pPr>
+            <w:r>
+              <w:rPr>
+                <w:b/>
+                <w:color w:val="1F3864"/>
+                <w:sz w:val="17"/>
+                <w:szCs w:val="17"/>
+              </w:rPr>
+              <w:t>Class</w:t>
+            </w:r>
+          </w:p>
+        </w:tc>
+        <w:tc>
+          <w:tcPr>
+            <w:tcW w:w="940" w:type="dxa"/>
+            <w:shd w:color="auto" w:fill="D9E2F3" w:val="clear"/>
+          </w:tcPr>
+          <w:p>
+            <w:pPr>
+              <w:spacing w:after="20" w:before="20" w:line="240" w:lineRule="auto"/>
+            </w:pPr>
+            <w:r>
+              <w:rPr>
+                <w:b/>
+                <w:color w:val="1F3864"/>
+                <w:sz w:val="17"/>
+                <w:szCs w:val="17"/>
+              </w:rPr>
+              <w:t>Kind</w:t>
+            </w:r>
+          </w:p>
+        </w:tc>
+        <w:tc>
+          <w:tcPr>
+            <w:tcW w:w="2891" w:type="dxa"/>
+            <w:shd w:color="auto" w:fill="D9E2F3" w:val="clear"/>
+          </w:tcPr>
+          <w:p>
+            <w:pPr>
+              <w:spacing w:after="20" w:before="20" w:line="240" w:lineRule="auto"/>
+            </w:pPr>
+            <w:r>
+              <w:rPr>
+                <w:b/>
+                <w:color w:val="1F3864"/>
+                <w:sz w:val="17"/>
+                <w:szCs w:val="17"/>
+              </w:rPr>
+              <w:t>Key attributes</w:t>
+            </w:r>
+          </w:p>
+        </w:tc>
+        <w:tc>
+          <w:tcPr>
+            <w:tcW w:w="3662" w:type="dxa"/>
+            <w:shd w:color="auto" w:fill="D9E2F3" w:val="clear"/>
+          </w:tcPr>
+          <w:p>
+            <w:pPr>
+              <w:spacing w:after="20" w:before="20" w:line="240" w:lineRule="auto"/>
+            </w:pPr>
+            <w:r>
+              <w:rPr>
+                <w:b/>
+                <w:color w:val="1F3864"/>
+                <w:sz w:val="17"/>
+                <w:szCs w:val="17"/>
+              </w:rPr>
+              <w:t>Key operations</w:t>
+            </w:r>
+          </w:p>
+        </w:tc>
+      </w:tr>
+      <w:tr>
+        <w:trPr>
+          <w:cantSplit/>
+          <w:hidden w:val="0"/>
+        </w:trPr>
+        <w:tc>
+          <w:tcPr>
+            <w:tcW w:w="2144" w:type="dxa"/>
+          </w:tcPr>
+          <w:p>
+            <w:pPr>
+              <w:spacing w:after="20" w:before="20" w:line="240" w:lineRule="auto"/>
+            </w:pPr>
+            <w:r>
+              <w:rPr>
+                <w:b/>
+                <w:sz w:val="17"/>
+                <w:szCs w:val="17"/>
+              </w:rPr>
+              <w:t>EventDispatcher</w:t>
+            </w:r>
+          </w:p>
+        </w:tc>
+        <w:tc>
+          <w:tcPr>
+            <w:tcW w:w="940" w:type="dxa"/>
+          </w:tcPr>
+          <w:p>
+            <w:pPr>
+              <w:spacing w:after="20" w:before="20" w:line="240" w:lineRule="auto"/>
+            </w:pPr>
+            <w:r>
+              <w:rPr>
+                <w:sz w:val="17"/>
+                <w:szCs w:val="17"/>
+              </w:rPr>
+              <w:t>singleton</w:t>
+            </w:r>
+          </w:p>
+        </w:tc>
+        <w:tc>
+          <w:tcPr>
+            <w:tcW w:w="2891" w:type="dxa"/>
+          </w:tcPr>
+          <w:p>
+            <w:pPr>
+              <w:spacing w:after="20" w:before="20" w:line="240" w:lineRule="auto"/>
+            </w:pPr>
+            <w:r>
+              <w:rPr>
+                <w:rFonts w:ascii="Consolas" w:hAnsi="Consolas" w:eastAsia="Consolas" w:cs="Consolas"/>
+                <w:color w:val="1F3864"/>
+                <w:sz w:val="15"/>
+                <w:szCs w:val="15"/>
+              </w:rPr>
+              <w:t>- listeners: vector&lt;WorkflowEventListener*&gt; // not owned</w:t>
+            </w:r>
+          </w:p>
+        </w:tc>
+        <w:tc>
+          <w:tcPr>
+            <w:tcW w:w="3662" w:type="dxa"/>
+          </w:tcPr>
+          <w:p>
+            <w:pPr>
+              <w:spacing w:after="20" w:before="20" w:line="240" w:lineRule="auto"/>
+            </w:pPr>
+            <w:r>
+              <w:rPr>
+                <w:rFonts w:ascii="Consolas" w:hAnsi="Consolas" w:eastAsia="Consolas" w:cs="Consolas"/>
+                <w:color w:val="1F3864"/>
+                <w:sz w:val="15"/>
+                <w:szCs w:val="15"/>
+              </w:rPr>
+              <w:t>+ getInstance(): EventDispatcher&amp; // static; returns a function-local static</w:t>
+              <w:br/>
+              <w:t>+ attachListener(l: WorkflowEventListener*)</w:t>
+              <w:br/>
+              <w:t>+ detachListener(l: WorkflowEventListener*)</w:t>
+              <w:br/>
+              <w:t>+ notifyListeners(e: const WorkflowEvent&amp;)</w:t>
+              <w:br/>
+              <w:t>- EventDispatcher() // private constructor</w:t>
+              <w:br/>
+              <w:t>EventDispatcher(const EventDispatcher&amp;) = delete</w:t>
+              <w:br/>
+              <w:t>operator=(const EventDispatcher&amp;) = delete</w:t>
+            </w:r>
+          </w:p>
+        </w:tc>
+      </w:tr>
+    </w:tbl>
+    <w:p>
+      <w:pPr>
+        <w:spacing w:after="40" w:before="0" w:line="192" w:lineRule="auto"/>
+      </w:pPr>
+    </w:p>
+    <w:p>
+      <w:pPr>
+        <w:keepNext/>
+        <w:spacing w:after="40" w:before="120" w:line="264" w:lineRule="auto"/>
+      </w:pPr>
+      <w:r>
+        <w:rPr>
+          <w:b/>
+          <w:color w:val="2F5496"/>
+          <w:sz w:val="19"/>
+          <w:szCs w:val="19"/>
+        </w:rPr>
+        <w:t>How it operates</w:t>
+      </w:r>
+    </w:p>
+    <w:p>
+      <w:pPr>
+        <w:spacing w:after="40" w:before="0" w:line="264" w:lineRule="auto"/>
+        <w:ind w:left="340"/>
+      </w:pPr>
+      <w:r>
+        <w:t>1. The first call to EventDispatcher::getInstance() creates the one instance as a function-local static (Meyers' Singleton); every later call returns the same object. C++11 makes this initialisation thread-safe and nothing is allocated on the heap.</w:t>
+      </w:r>
+    </w:p>
+    <w:p>
+      <w:pPr>
+        <w:spacing w:after="40" w:before="0" w:line="264" w:lineRule="auto"/>
+        <w:ind w:left="340"/>
+      </w:pPr>
+      <w:r>
+        <w:t>2. The private constructor and the deleted copy constructor and assignment operator stop any other code from creating a second dispatcher.</w:t>
+      </w:r>
+    </w:p>
+    <w:p>
+      <w:pPr>
+        <w:spacing w:after="40" w:before="0" w:line="264" w:lineRule="auto"/>
+        <w:ind w:left="340"/>
+      </w:pPr>
+      <w:r>
+        <w:t>3. When the client calls addListener(l) on the facade, the engine keeps ownership of l and attaches it once with EventDispatcher::getInstance().attachListener(l) (3.8).</w:t>
+      </w:r>
+    </w:p>
+    <w:p>
+      <w:pPr>
+        <w:spacing w:after="40" w:before="0" w:line="264" w:lineRule="auto"/>
+        <w:ind w:left="340"/>
+      </w:pPr>
+      <w:r>
+        <w:t>4. On every state transition a work item calls publish(e), which calls EventDispatcher::getInstance().notifyListeners(e). No dispatcher pointer is passed through builders, instances or constructors.</w:t>
+      </w:r>
+    </w:p>
+    <w:p>
+      <w:pPr>
+        <w:spacing w:after="40" w:before="0" w:line="264" w:lineRule="auto"/>
+        <w:ind w:left="340"/>
+      </w:pPr>
+      <w:r>
+        <w:t>5. All instances share the one dispatcher, so AuditLogger and MonitoringService see every event of every instance in one order; listeners use e.instanceId to tell instances apart.</w:t>
+      </w:r>
+    </w:p>
+    <w:p>
+      <w:pPr>
+        <w:keepNext/>
+        <w:spacing w:after="40" w:before="120" w:line="264" w:lineRule="auto"/>
+      </w:pPr>
+      <w:r>
+        <w:rPr>
+          <w:b/>
+          <w:color w:val="2F5496"/>
+          <w:sz w:val="19"/>
+          <w:szCs w:val="19"/>
+        </w:rPr>
+        <w:t>Relationships to draw</w:t>
+      </w:r>
+    </w:p>
+    <w:p>
+      <w:pPr>
+        <w:spacing w:after="40" w:before="0" w:line="264" w:lineRule="auto"/>
+        <w:ind w:left="340"/>
+      </w:pPr>
+      <w:r>
+        <w:t>• EventDispatcher: draw with the «singleton» stereotype, getInstance() underlined as a static operation and the constructor private.</w:t>
+      </w:r>
+    </w:p>
+    <w:p>
+      <w:pPr>
+        <w:spacing w:after="40" w:before="0" w:line="264" w:lineRule="auto"/>
+        <w:ind w:left="340"/>
+      </w:pPr>
+      <w:r>
+        <w:t>• EventDispatcher → WorkflowEventListener: association (listeners), 1 → 0..*, not owned (see 3.8).</w:t>
+      </w:r>
+    </w:p>
+    <w:p>
+      <w:pPr>
+        <w:spacing w:after="40" w:before="0" w:line="264" w:lineRule="auto"/>
+        <w:ind w:left="340"/>
+      </w:pPr>
+      <w:r>
+        <w:t>• WorkItem → EventDispatcher: dependency (calls getInstance() to publish).</w:t>
+      </w:r>
+    </w:p>
+    <w:p>
+      <w:pPr>
+        <w:spacing w:after="40" w:before="0" w:line="264" w:lineRule="auto"/>
+        <w:ind w:left="340"/>
+      </w:pPr>
+      <w:r>
+        <w:t>• WorkflowEngine → EventDispatcher: dependency (attaches the listeners it owns).</w:t>
+      </w:r>
+    </w:p>
+    <w:p>
+      <w:pPr>
+        <w:pStyle w:val="Heading2"/>
+        <w:keepNext/>
+      </w:pPr>
+      <w:r>
+        <w:rPr>
           <w:sz w:val="24"/>
           <w:szCs w:val="24"/>
         </w:rPr>
@@ -14033,7 +14437,7 @@
                 <w:sz w:val="17"/>
                 <w:szCs w:val="17"/>
               </w:rPr>
-              <w:t>Composite: Component · Decorator: Component · State: Context · Observer: Subject · Command: Receiver · Mediator: Colleague</w:t>
+              <w:t>Composite: Component · Decorator: Component · State: Context · Observer: publisher (via EventDispatcher) · Command: Receiver · Mediator: Colleague</w:t>
             </w:r>
           </w:p>
         </w:tc>
@@ -14234,6 +14638,46 @@
                 <w:szCs w:val="17"/>
               </w:rPr>
               <w:t>Observer: ConcreteObserver · used by AuditDecorator</w:t>
+            </w:r>
+          </w:p>
+        </w:tc>
+      </w:tr>
+      <w:tr>
+        <w:trPr>
+          <w:cantSplit/>
+          <w:hidden w:val="0"/>
+        </w:trPr>
+        <w:tc>
+          <w:tcPr>
+            <w:tcW w:w="2313" w:type="dxa"/>
+          </w:tcPr>
+          <w:p>
+            <w:pPr>
+              <w:spacing w:after="20" w:before="20" w:line="240" w:lineRule="auto"/>
+            </w:pPr>
+            <w:r>
+              <w:rPr>
+                <w:sz w:val="17"/>
+                <w:szCs w:val="17"/>
+              </w:rPr>
+              <w:t>EventDispatcher</w:t>
+            </w:r>
+          </w:p>
+        </w:tc>
+        <w:tc>
+          <w:tcPr>
+            <w:tcW w:w="7325" w:type="dxa"/>
+          </w:tcPr>
+          <w:p>
+            <w:pPr>
+              <w:spacing w:after="20" w:before="20" w:line="240" w:lineRule="auto"/>
+            </w:pPr>
+            <w:r>
+              <w:rPr>
+                <w:sz w:val="17"/>
+                <w:szCs w:val="17"/>
+              </w:rPr>
+              <w:t>Singleton: Singleton · Observer: Subject</w:t>
             </w:r>
           </w:p>
         </w:tc>
@@ -15284,14 +15728,13 @@
                 <w:sz w:val="17"/>
                 <w:szCs w:val="17"/>
               </w:rPr>
-              <w:t>Not owned (plain association):</w:t>
-            </w:r>
-            <w:r>
-              <w:rPr>
-                <w:sz w:val="17"/>
-                <w:szCs w:val="17"/>
-              </w:rPr>
-              <w:t xml:space="preserve"> WorkItem → listeners, WorkItem → mediator, WorkItem → parent, Task → assignee, DependencyMediator → items, WorkflowInstance → definition.</w:t>
+              <w:t>Not owned (plain association): EventDispatcher → listeners, WorkItem → mediator, WorkItem → parent, Task → assignee, DependencyMediator → items, WorkflowInstance → definition. EventDispatcher itself is a function-local static (3.13): no class owns it and it lives until the program ends.</w:t>
+            </w:r>
+            <w:r>
+              <w:rPr>
+                <w:sz w:val="17"/>
+                <w:szCs w:val="17"/>
+              </w:rPr>
             </w:r>
           </w:p>
         </w:tc>
@@ -15988,7 +16431,7 @@
           <w:sz w:val="19"/>
           <w:szCs w:val="19"/>
         </w:rPr>
-        <w:t>), registers adapters (</w:t>
+        <w:t>), registers adapters (addService) and listeners (addListener), which the engine attaches once to EventDispatcher::getInstance() (Singleton, Observer).</w:t>
       </w:r>
       <w:r>
         <w:rPr>
@@ -15997,14 +16440,12 @@
           <w:sz w:val="17"/>
           <w:szCs w:val="17"/>
         </w:rPr>
-        <w:t>addService</w:t>
       </w:r>
       <w:r>
         <w:rPr>
           <w:sz w:val="19"/>
           <w:szCs w:val="19"/>
         </w:rPr>
-        <w:t>) and listeners (</w:t>
       </w:r>
       <w:r>
         <w:rPr>
@@ -16013,14 +16454,12 @@
           <w:sz w:val="17"/>
           <w:szCs w:val="17"/>
         </w:rPr>
-        <w:t>addListener</w:t>
       </w:r>
       <w:r>
         <w:rPr>
           <w:sz w:val="19"/>
           <w:szCs w:val="19"/>
         </w:rPr>
-        <w:t>).</w:t>
       </w:r>
     </w:p>
     <w:p>
@@ -16180,7 +16619,7 @@
           <w:sz w:val="19"/>
           <w:szCs w:val="19"/>
         </w:rPr>
-        <w:t>, registers every item with it and attaches the listeners (Observer).</w:t>
+        <w:t xml:space="preserve"> and registers every item with it. No listeners are passed to the new items, because they publish through EventDispatcher.</w:t>
       </w:r>
     </w:p>
     <w:p>
@@ -16292,7 +16731,7 @@
           <w:sz w:val="19"/>
           <w:szCs w:val="19"/>
         </w:rPr>
-        <w:t>: its strategy selects a participant and the task is assigned (Available → Assigned). Listeners receive AVAILABLE and ASSIGNED.</w:t>
+        <w:t>: its strategy selects a participant and the task is assigned (Available → Assigned). Each transition is published through EventDispatcher, so the listeners receive AVAILABLE and ASSIGNED (Observer).</w:t>
       </w:r>
     </w:p>
     <w:p>
@@ -17644,7 +18083,7 @@
           <w:sz w:val="19"/>
           <w:szCs w:val="19"/>
         </w:rPr>
-        <w:t>Remove the old classes: AdmissionsMediator, ApproveAction, IdentityVerificationService, PaymentService, and the Approved/Rejected states on WorkflowInstance.</w:t>
+        <w:t>Remove the old classes: AdmissionsMediator, ApproveAction, IdentityVerificationService, PaymentService, and the Approved/Rejected states on WorkflowInstance. Also remove the listeners list and attach/detach operations from WorkItem, because listeners now attach to EventDispatcher.</w:t>
       </w:r>
     </w:p>
     <w:p>
@@ -17677,6 +18116,15 @@
           <w:szCs w:val="19"/>
         </w:rPr>
         <w:t>Check the diagrams agree: the state diagram shows the 8 work-item states of section 5, sequence diagram 2 uses CompleteAction and the COMPLETED event, and activity diagram 1 ends with the instance completing.</w:t>
+      </w:r>
+    </w:p>
+    <w:p>
+      <w:pPr>
+        <w:spacing w:after="40" w:before="0" w:line="264" w:lineRule="auto"/>
+        <w:ind w:left="340"/>
+      </w:pPr>
+      <w:r>
+        <w:t>7. Show EventDispatcher once, coloured as Events, with the «singleton» stereotype, a static getInstance() and a private constructor (3.13).</w:t>
       </w:r>
     </w:p>
     <w:sectPr>

</xml_diff>